<commit_message>
Revise Teaching manuscript after major-review feedback
</commit_message>
<xml_diff>
--- a/docs/evidence/review-packets/emse-submission-v1/emse-cover-letter-draft-v1.docx
+++ b/docs/evidence/review-packets/emse-submission-v1/emse-cover-letter-draft-v1.docx
@@ -52,7 +52,7 @@
     <w:p/>
     <w:p>
       <w:r>
-        <w:t>Date: 2026-04-11</w:t>
+        <w:t>Date: 2026-06-05</w:t>
       </w:r>
     </w:p>
     <w:p>
@@ -87,7 +87,7 @@
         <w:rPr>
           <w:i/>
         </w:rPr>
-        <w:t>Protocol-Mediated Uplift in Agentic Workflows: Cross-Provider Evidence and Bounded Local Resilience</w:t>
+        <w:t>Evaluating Protocol-Scaffolded Agentic Workflows Across LLM Providers</w:t>
       </w:r>
       <w:r>
         <w:t xml:space="preserve">, for publication in </w:t>

</xml_diff>